<commit_message>
implementation of docling for parsin document
</commit_message>
<xml_diff>
--- a/input/DOC-004.docx
+++ b/input/DOC-004.docx
@@ -9,53 +9,73 @@
       <w:r>
         <w:rPr>
           <w:b/>
-          <w:sz w:val="38"/>
+          <w:sz w:val="44"/>
         </w:rPr>
-        <w:t>PROJECT OVERVIEW — KNOWLEDGE ASSISTANT</w:t>
+        <w:t>HR Policy Knowledge System</w:t>
+      </w:r>
+    </w:p>
+    <w:p>
+      <w:pPr>
+        <w:jc w:val="center"/>
+      </w:pPr>
+      <w:r>
+        <w:rPr>
+          <w:b/>
+          <w:sz w:val="28"/>
+        </w:rPr>
+        <w:t>Architecture Overview</w:t>
+      </w:r>
+    </w:p>
+    <w:p>
+      <w:pPr>
+        <w:jc w:val="center"/>
+      </w:pPr>
+      <w:r>
+        <w:drawing>
+          <wp:inline xmlns:a="http://schemas.openxmlformats.org/drawingml/2006/main" xmlns:pic="http://schemas.openxmlformats.org/drawingml/2006/picture">
+            <wp:extent cx="6126480" cy="3719649"/>
+            <wp:docPr id="1" name="Picture 1"/>
+            <wp:cNvGraphicFramePr>
+              <a:graphicFrameLocks noChangeAspect="1"/>
+            </wp:cNvGraphicFramePr>
+            <a:graphic>
+              <a:graphicData uri="http://schemas.openxmlformats.org/drawingml/2006/picture">
+                <pic:pic>
+                  <pic:nvPicPr>
+                    <pic:cNvPr id="0" name="architecture.png"/>
+                    <pic:cNvPicPr/>
+                  </pic:nvPicPr>
+                  <pic:blipFill>
+                    <a:blip r:embed="rId9"/>
+                    <a:stretch>
+                      <a:fillRect/>
+                    </a:stretch>
+                  </pic:blipFill>
+                  <pic:spPr>
+                    <a:xfrm>
+                      <a:off x="0" y="0"/>
+                      <a:ext cx="6126480" cy="3719649"/>
+                    </a:xfrm>
+                    <a:prstGeom prst="rect"/>
+                  </pic:spPr>
+                </pic:pic>
+              </a:graphicData>
+            </a:graphic>
+          </wp:inline>
+        </w:drawing>
+      </w:r>
+    </w:p>
+    <w:p>
+      <w:pPr>
+        <w:pStyle w:val="Heading2"/>
+      </w:pPr>
+      <w:r>
+        <w:t>Architecture Description</w:t>
       </w:r>
     </w:p>
     <w:p>
       <w:r>
-        <w:rPr>
-          <w:b/>
-        </w:rPr>
-        <w:t xml:space="preserve">Project Goal: </w:t>
-      </w:r>
-      <w:r>
-        <w:t>Build an internal knowledge assistant that allows authorized employees to ask questions about company and project documents and receive evidence-backed answers.</w:t>
-      </w:r>
-    </w:p>
-    <w:p>
-      <w:r>
-        <w:rPr>
-          <w:b/>
-        </w:rPr>
-        <w:t xml:space="preserve">Problem Statement: </w:t>
-      </w:r>
-      <w:r>
-        <w:t>Important organizational knowledge is distributed across employee handbooks, project documents, technical material, and other files. Employees need a controlled way to find relevant information without exposing documents they are not authorized to access.</w:t>
-      </w:r>
-    </w:p>
-    <w:p>
-      <w:r>
-        <w:rPr>
-          <w:b/>
-        </w:rPr>
-        <w:t xml:space="preserve">Core Approach: </w:t>
-      </w:r>
-      <w:r>
-        <w:t>The system uses retrieval-augmented generation (RAG): documents are ingested into a searchable knowledge store, relevant evidence is retrieved for a user question, and the answer is generated using the selected evidence.</w:t>
-      </w:r>
-    </w:p>
-    <w:p>
-      <w:r>
-        <w:rPr>
-          <w:b/>
-        </w:rPr>
-        <w:t xml:space="preserve">Success Criteria: </w:t>
-      </w:r>
-      <w:r>
-        <w:t>Answers should be grounded in available documents, include useful citations, respect user authorization, reject questions outside the available knowledge, and remain maintainable as document and user counts grow.</w:t>
+        <w:t>The system follows a modular-monolith approach. The Streamlit client sends requests to a FastAPI API layer. Application services coordinate authentication, authorization, retrieval, and business workflows. The domain layer contains core business rules, while repositories isolate persistence details. SQLite stores application and access-control data, while ChromaDB stores document embeddings used for semantic retrieval.</w:t>
       </w:r>
     </w:p>
     <w:p>
@@ -68,10 +88,22 @@
         <w:jc w:val="center"/>
       </w:pPr>
       <w:r>
+        <w:rPr>
+          <w:b/>
+          <w:sz w:val="40"/>
+        </w:rPr>
+        <w:t>Request and Retrieval Flow</w:t>
+      </w:r>
+    </w:p>
+    <w:p>
+      <w:pPr>
+        <w:jc w:val="center"/>
+      </w:pPr>
+      <w:r>
         <w:drawing>
           <wp:inline xmlns:a="http://schemas.openxmlformats.org/drawingml/2006/main" xmlns:pic="http://schemas.openxmlformats.org/drawingml/2006/picture">
-            <wp:extent cx="6309360" cy="3830683"/>
-            <wp:docPr id="1" name="Picture 1"/>
+            <wp:extent cx="6126480" cy="4157254"/>
+            <wp:docPr id="2" name="Picture 2"/>
             <wp:cNvGraphicFramePr>
               <a:graphicFrameLocks noChangeAspect="1"/>
             </wp:cNvGraphicFramePr>
@@ -79,11 +111,11 @@
               <a:graphicData uri="http://schemas.openxmlformats.org/drawingml/2006/picture">
                 <pic:pic>
                   <pic:nvPicPr>
-                    <pic:cNvPr id="0" name="project_architecture.png"/>
+                    <pic:cNvPr id="0" name="flowchart.png"/>
                     <pic:cNvPicPr/>
                   </pic:nvPicPr>
                   <pic:blipFill>
-                    <a:blip r:embed="rId9"/>
+                    <a:blip r:embed="rId10"/>
                     <a:stretch>
                       <a:fillRect/>
                     </a:stretch>
@@ -91,7 +123,7 @@
                   <pic:spPr>
                     <a:xfrm>
                       <a:off x="0" y="0"/>
-                      <a:ext cx="6309360" cy="3830683"/>
+                      <a:ext cx="6126480" cy="4157254"/>
                     </a:xfrm>
                     <a:prstGeom prst="rect"/>
                   </pic:spPr>
@@ -100,6 +132,46 @@
             </a:graphic>
           </wp:inline>
         </w:drawing>
+      </w:r>
+    </w:p>
+    <w:p>
+      <w:pPr>
+        <w:pStyle w:val="Heading2"/>
+      </w:pPr>
+      <w:r>
+        <w:t>What Happens During a Query?</w:t>
+      </w:r>
+    </w:p>
+    <w:p>
+      <w:pPr>
+        <w:pStyle w:val="ListBullet"/>
+      </w:pPr>
+      <w:r>
+        <w:t>The user submits a natural-language question through the chat interface.</w:t>
+      </w:r>
+    </w:p>
+    <w:p>
+      <w:pPr>
+        <w:pStyle w:val="ListBullet"/>
+      </w:pPr>
+      <w:r>
+        <w:t>The backend verifies the user's identity and determines which documents the user is allowed to access.</w:t>
+      </w:r>
+    </w:p>
+    <w:p>
+      <w:pPr>
+        <w:pStyle w:val="ListBullet"/>
+      </w:pPr>
+      <w:r>
+        <w:t>The retrieval layer searches authorized document chunks and selects relevant evidence.</w:t>
+      </w:r>
+    </w:p>
+    <w:p>
+      <w:pPr>
+        <w:pStyle w:val="ListBullet"/>
+      </w:pPr>
+      <w:r>
+        <w:t>The answer-generation step uses the selected evidence and returns citations so the user can trace the response.</w:t>
       </w:r>
     </w:p>
     <w:p>
@@ -112,10 +184,22 @@
         <w:jc w:val="center"/>
       </w:pPr>
       <w:r>
+        <w:rPr>
+          <w:b/>
+          <w:sz w:val="40"/>
+        </w:rPr>
+        <w:t>Document Ingestion and Data Model</w:t>
+      </w:r>
+    </w:p>
+    <w:p>
+      <w:pPr>
+        <w:jc w:val="center"/>
+      </w:pPr>
+      <w:r>
         <w:drawing>
           <wp:inline xmlns:a="http://schemas.openxmlformats.org/drawingml/2006/main" xmlns:pic="http://schemas.openxmlformats.org/drawingml/2006/picture">
-            <wp:extent cx="6309360" cy="3830683"/>
-            <wp:docPr id="2" name="Picture 2"/>
+            <wp:extent cx="6126480" cy="3719649"/>
+            <wp:docPr id="3" name="Picture 3"/>
             <wp:cNvGraphicFramePr>
               <a:graphicFrameLocks noChangeAspect="1"/>
             </wp:cNvGraphicFramePr>
@@ -123,11 +207,11 @@
               <a:graphicData uri="http://schemas.openxmlformats.org/drawingml/2006/picture">
                 <pic:pic>
                   <pic:nvPicPr>
-                    <pic:cNvPr id="0" name="project_milestones.png"/>
+                    <pic:cNvPr id="0" name="pipeline.png"/>
                     <pic:cNvPicPr/>
                   </pic:nvPicPr>
                   <pic:blipFill>
-                    <a:blip r:embed="rId10"/>
+                    <a:blip r:embed="rId11"/>
                     <a:stretch>
                       <a:fillRect/>
                     </a:stretch>
@@ -135,7 +219,7 @@
                   <pic:spPr>
                     <a:xfrm>
                       <a:off x="0" y="0"/>
-                      <a:ext cx="6309360" cy="3830683"/>
+                      <a:ext cx="6126480" cy="3719649"/>
                     </a:xfrm>
                     <a:prstGeom prst="rect"/>
                   </pic:spPr>
@@ -146,9 +230,328 @@
         </w:drawing>
       </w:r>
     </w:p>
+    <w:p>
+      <w:pPr>
+        <w:pStyle w:val="Heading2"/>
+      </w:pPr>
+      <w:r>
+        <w:t>Example System Data</w:t>
+      </w:r>
+    </w:p>
+    <w:tbl>
+      <w:tblPr>
+        <w:tblStyle w:val="TableGrid"/>
+        <w:tblW w:type="auto" w:w="0"/>
+        <w:jc w:val="center"/>
+        <w:tblLook w:firstColumn="1" w:firstRow="1" w:lastColumn="0" w:lastRow="0" w:noHBand="0" w:noVBand="1" w:val="04A0"/>
+      </w:tblPr>
+      <w:tblGrid>
+        <w:gridCol w:w="2556"/>
+        <w:gridCol w:w="2556"/>
+        <w:gridCol w:w="2556"/>
+        <w:gridCol w:w="2556"/>
+      </w:tblGrid>
+      <w:tr>
+        <w:tc>
+          <w:tcPr>
+            <w:tcW w:type="dxa" w:w="2556"/>
+          </w:tcPr>
+          <w:p>
+            <w:r>
+              <w:rPr>
+                <w:b/>
+              </w:rPr>
+              <w:t>Component</w:t>
+            </w:r>
+          </w:p>
+        </w:tc>
+        <w:tc>
+          <w:tcPr>
+            <w:tcW w:type="dxa" w:w="2556"/>
+          </w:tcPr>
+          <w:p>
+            <w:r>
+              <w:rPr>
+                <w:b/>
+              </w:rPr>
+              <w:t>Purpose</w:t>
+            </w:r>
+          </w:p>
+        </w:tc>
+        <w:tc>
+          <w:tcPr>
+            <w:tcW w:type="dxa" w:w="2556"/>
+          </w:tcPr>
+          <w:p>
+            <w:r>
+              <w:rPr>
+                <w:b/>
+              </w:rPr>
+              <w:t>Example</w:t>
+            </w:r>
+          </w:p>
+        </w:tc>
+        <w:tc>
+          <w:tcPr>
+            <w:tcW w:type="dxa" w:w="2556"/>
+          </w:tcPr>
+          <w:p>
+            <w:r>
+              <w:rPr>
+                <w:b/>
+              </w:rPr>
+              <w:t>Output</w:t>
+            </w:r>
+          </w:p>
+        </w:tc>
+      </w:tr>
+      <w:tr>
+        <w:tc>
+          <w:tcPr>
+            <w:tcW w:type="dxa" w:w="2556"/>
+            <w:vAlign w:val="center"/>
+          </w:tcPr>
+          <w:p>
+            <w:r>
+              <w:t>User</w:t>
+            </w:r>
+          </w:p>
+        </w:tc>
+        <w:tc>
+          <w:tcPr>
+            <w:tcW w:type="dxa" w:w="2556"/>
+            <w:vAlign w:val="center"/>
+          </w:tcPr>
+          <w:p>
+            <w:r>
+              <w:t>Identity and access</w:t>
+            </w:r>
+          </w:p>
+        </w:tc>
+        <w:tc>
+          <w:tcPr>
+            <w:tcW w:type="dxa" w:w="2556"/>
+            <w:vAlign w:val="center"/>
+          </w:tcPr>
+          <w:p>
+            <w:r>
+              <w:t>EMP-1042</w:t>
+            </w:r>
+          </w:p>
+        </w:tc>
+        <w:tc>
+          <w:tcPr>
+            <w:tcW w:type="dxa" w:w="2556"/>
+            <w:vAlign w:val="center"/>
+          </w:tcPr>
+          <w:p>
+            <w:r>
+              <w:t>Authorized session</w:t>
+            </w:r>
+          </w:p>
+        </w:tc>
+      </w:tr>
+      <w:tr>
+        <w:tc>
+          <w:tcPr>
+            <w:tcW w:type="dxa" w:w="2556"/>
+            <w:vAlign w:val="center"/>
+          </w:tcPr>
+          <w:p>
+            <w:r>
+              <w:t>Project</w:t>
+            </w:r>
+          </w:p>
+        </w:tc>
+        <w:tc>
+          <w:tcPr>
+            <w:tcW w:type="dxa" w:w="2556"/>
+            <w:vAlign w:val="center"/>
+          </w:tcPr>
+          <w:p>
+            <w:r>
+              <w:t>Groups related documents</w:t>
+            </w:r>
+          </w:p>
+        </w:tc>
+        <w:tc>
+          <w:tcPr>
+            <w:tcW w:type="dxa" w:w="2556"/>
+            <w:vAlign w:val="center"/>
+          </w:tcPr>
+          <w:p>
+            <w:r>
+              <w:t>Onboarding Project</w:t>
+            </w:r>
+          </w:p>
+        </w:tc>
+        <w:tc>
+          <w:tcPr>
+            <w:tcW w:type="dxa" w:w="2556"/>
+            <w:vAlign w:val="center"/>
+          </w:tcPr>
+          <w:p>
+            <w:r>
+              <w:t>Project access</w:t>
+            </w:r>
+          </w:p>
+        </w:tc>
+      </w:tr>
+      <w:tr>
+        <w:tc>
+          <w:tcPr>
+            <w:tcW w:type="dxa" w:w="2556"/>
+            <w:vAlign w:val="center"/>
+          </w:tcPr>
+          <w:p>
+            <w:r>
+              <w:t>Document</w:t>
+            </w:r>
+          </w:p>
+        </w:tc>
+        <w:tc>
+          <w:tcPr>
+            <w:tcW w:type="dxa" w:w="2556"/>
+            <w:vAlign w:val="center"/>
+          </w:tcPr>
+          <w:p>
+            <w:r>
+              <w:t>Stores source metadata</w:t>
+            </w:r>
+          </w:p>
+        </w:tc>
+        <w:tc>
+          <w:tcPr>
+            <w:tcW w:type="dxa" w:w="2556"/>
+            <w:vAlign w:val="center"/>
+          </w:tcPr>
+          <w:p>
+            <w:r>
+              <w:t>Employee Handbook</w:t>
+            </w:r>
+          </w:p>
+        </w:tc>
+        <w:tc>
+          <w:tcPr>
+            <w:tcW w:type="dxa" w:w="2556"/>
+            <w:vAlign w:val="center"/>
+          </w:tcPr>
+          <w:p>
+            <w:r>
+              <w:t>Document record</w:t>
+            </w:r>
+          </w:p>
+        </w:tc>
+      </w:tr>
+      <w:tr>
+        <w:tc>
+          <w:tcPr>
+            <w:tcW w:type="dxa" w:w="2556"/>
+            <w:vAlign w:val="center"/>
+          </w:tcPr>
+          <w:p>
+            <w:r>
+              <w:t>Chunk</w:t>
+            </w:r>
+          </w:p>
+        </w:tc>
+        <w:tc>
+          <w:tcPr>
+            <w:tcW w:type="dxa" w:w="2556"/>
+            <w:vAlign w:val="center"/>
+          </w:tcPr>
+          <w:p>
+            <w:r>
+              <w:t>Small searchable text unit</w:t>
+            </w:r>
+          </w:p>
+        </w:tc>
+        <w:tc>
+          <w:tcPr>
+            <w:tcW w:type="dxa" w:w="2556"/>
+            <w:vAlign w:val="center"/>
+          </w:tcPr>
+          <w:p>
+            <w:r>
+              <w:t>Leave policy section</w:t>
+            </w:r>
+          </w:p>
+        </w:tc>
+        <w:tc>
+          <w:tcPr>
+            <w:tcW w:type="dxa" w:w="2556"/>
+            <w:vAlign w:val="center"/>
+          </w:tcPr>
+          <w:p>
+            <w:r>
+              <w:t>Vector embedding</w:t>
+            </w:r>
+          </w:p>
+        </w:tc>
+      </w:tr>
+      <w:tr>
+        <w:tc>
+          <w:tcPr>
+            <w:tcW w:type="dxa" w:w="2556"/>
+            <w:vAlign w:val="center"/>
+          </w:tcPr>
+          <w:p>
+            <w:r>
+              <w:t>Permission</w:t>
+            </w:r>
+          </w:p>
+        </w:tc>
+        <w:tc>
+          <w:tcPr>
+            <w:tcW w:type="dxa" w:w="2556"/>
+            <w:vAlign w:val="center"/>
+          </w:tcPr>
+          <w:p>
+            <w:r>
+              <w:t>Controls resource access</w:t>
+            </w:r>
+          </w:p>
+        </w:tc>
+        <w:tc>
+          <w:tcPr>
+            <w:tcW w:type="dxa" w:w="2556"/>
+            <w:vAlign w:val="center"/>
+          </w:tcPr>
+          <w:p>
+            <w:r>
+              <w:t>Project = HR</w:t>
+            </w:r>
+          </w:p>
+        </w:tc>
+        <w:tc>
+          <w:tcPr>
+            <w:tcW w:type="dxa" w:w="2556"/>
+            <w:vAlign w:val="center"/>
+          </w:tcPr>
+          <w:p>
+            <w:r>
+              <w:t>Allow / deny</w:t>
+            </w:r>
+          </w:p>
+        </w:tc>
+      </w:tr>
+    </w:tbl>
+    <w:p>
+      <w:pPr>
+        <w:pStyle w:val="Heading2"/>
+      </w:pPr>
+      <w:r>
+        <w:t>Key Design Principles</w:t>
+      </w:r>
+    </w:p>
+    <w:p>
+      <w:r>
+        <w:t>Separation of responsibilities keeps the system easier to test and change. Authentication answers who the user is; authorization answers what the user can access; retrieval finds evidence only from authorized sources; and answer generation produces a response grounded in that evidence.</w:t>
+      </w:r>
+    </w:p>
     <w:sectPr>
       <w:pgSz w:w="12240" w:h="15840"/>
-      <w:pgMar w:top="936" w:right="1080" w:bottom="936" w:left="1080" w:header="720" w:footer="720" w:gutter="0"/>
+      <w:pgMar w:top="936" w:right="1008" w:bottom="936" w:left="1008" w:header="720" w:footer="720" w:gutter="0"/>
       <w:cols w:space="720"/>
       <w:docGrid w:linePitch="360"/>
     </w:sectPr>
@@ -520,8 +923,8 @@
     <w:qFormat/>
     <w:rsid w:val="00FC693F"/>
     <w:rPr>
-      <w:rFonts w:ascii="Arial" w:hAnsi="Arial"/>
-      <w:sz w:val="20"/>
+      <w:rFonts w:ascii="Aptos" w:hAnsi="Aptos"/>
+      <w:sz w:val="21"/>
     </w:rPr>
   </w:style>
   <w:style w:type="paragraph" w:styleId="Header">

</xml_diff>